<commit_message>
docs: fill in real GitHub repository URL and reviewer-invite findings
Adds the actual private repo URL to the README and submission
document, and documents a real platform constraint discovered while
attempting to invite reviewers: GitHub's collaborator API only accepts
a username for a personal-account repo, not a raw email (email invites
are org-only), confirmed via a live 404 against the pushed repo.
</commit_message>
<xml_diff>
--- a/Darukaa_Earth_Hackathon_Submission.docx
+++ b/Darukaa_Earth_Hackathon_Submission.docx
@@ -99,7 +99,7 @@
           </w:tcPr>
           <w:p>
             <w:r>
-              <w:t>[SUBMISSION DATE]</w:t>
+              <w:t>2026-09-17</w:t>
             </w:r>
           </w:p>
         </w:tc>
@@ -192,11 +192,7 @@
         <w:t xml:space="preserve">GitHub repository URL: </w:t>
       </w:r>
       <w:r>
-        <w:rPr>
-          <w:i/>
-          <w:color w:val="B05A00"/>
-        </w:rPr>
-        <w:t>[PLACEHOLDER — fill in before sharing]</w:t>
+        <w:t>https://github.com/AashrithaReddy-19/darukaa-earth  (private)</w:t>
       </w:r>
     </w:p>
     <w:p>
@@ -258,6 +254,15 @@
           <w:i/>
         </w:rPr>
         <w:t>e.g. https://darukaa-backend.onrender.com — Swagger docs available at /docs</w:t>
+      </w:r>
+    </w:p>
+    <w:p>
+      <w:r>
+        <w:rPr>
+          <w:b w:val="0"/>
+          <w:i/>
+        </w:rPr>
+        <w:t>The repository, CI pipeline, and local/Docker environment are complete and verified (see sections 8 and 9). The frontend and backend deployment URLs above are pending creation of a Vercel project and a Render service, which require interactive account access this document's author did not have at submission time — see section 10.</w:t>
       </w:r>
     </w:p>
     <w:p>
@@ -353,7 +358,7 @@
         <w:rPr>
           <w:color w:val="1B4032"/>
         </w:rPr>
-        <w:t>4. Repository Access (if private)</w:t>
+        <w:t>4. Repository Access (private repository)</w:t>
       </w:r>
     </w:p>
     <w:p>
@@ -362,7 +367,7 @@
           <w:b w:val="0"/>
           <w:i w:val="0"/>
         </w:rPr>
-        <w:t>If the GitHub repository is kept private, grant repository access to the following reviewer accounts:</w:t>
+        <w:t>The repository above is private. Grant repository access to the following reviewer accounts:</w:t>
       </w:r>
     </w:p>
     <w:p>
@@ -403,7 +408,7 @@
           <w:b/>
           <w:i w:val="0"/>
         </w:rPr>
-        <w:t>Note: these reviewers have NOT been invited yet. The repository owner must manually add them as collaborators (GitHub repository → Settings → Collaborators and teams → Add people) after creating the private repository, before this document is shared.</w:t>
+        <w:t>Note: these reviewers have NOT been invited yet. GitHub's collaborator API for a personal-account repository only accepts an existing GitHub username, not a raw email address (email-based invitations are an organization-only feature) — an automated invite by email was attempted and confirmed not possible for this repository. The repository owner must manually add each reviewer from the GitHub web UI (repository → Settings → Collaborators and teams → Add people), where typing an email address is supported and will send a real invitation, before this document is shared.</w:t>
       </w:r>
     </w:p>
     <w:p>
@@ -638,7 +643,16 @@
           <w:b w:val="0"/>
           <w:i w:val="0"/>
         </w:rPr>
-        <w:t>GitHub Actions workflow ci.yml runs on every pull request and push to main: the frontend job installs dependencies, lints, type-checks, runs unit tests, and builds for production; the backend job spins up a PostGIS service container, then runs Ruff, Black (check mode), Alembic migrations, and the pytest suite. A second workflow, deploy.yml, offers an optional fully-scripted deployment path (frontend via the Vercel CLI, backend via a Render deploy hook) driven entirely by GitHub Actions secrets — no credentials are stored in the repo.</w:t>
+        <w:t>GitHub Actions workflow ci.yml runs on every pull request and push to main: the frontend job installs dependencies, lints, type-checks, runs unit tests, and builds for production; the backend job spins up a PostGIS service container, then runs Ruff, Black (check mode), Alembic migrations, and the pytest suite. A second workflow, deploy.yml, offers an optional fully-scripted deployment path (frontend via the Vercel CLI, backend via a Render deploy hook) driven entirely by GitHub Actions secrets — no credentials are stored in the repo; until those secrets are added it skips cleanly rather than failing the run.</w:t>
+      </w:r>
+    </w:p>
+    <w:p>
+      <w:r>
+        <w:rPr>
+          <w:b w:val="0"/>
+          <w:i/>
+        </w:rPr>
+        <w:t>Both workflows have been verified against the real, pushed repository: the CI run on the initial push completed successfully (frontend lint/typecheck/test/build and backend ruff/black/pytest all green), and the Deploy workflow correctly skips its Vercel/Render steps with a notice until deployment secrets are configured.</w:t>
       </w:r>
     </w:p>
     <w:p>

</xml_diff>

<commit_message>
docs: add live deployment URLs and deployment notes
App is fully deployed and verified live: frontend on Vercel, backend +
PostGIS on Render, production database migrated and seeded. Documents
the two platform-specific deployment paths actually used (CLI-driven
image deploy on Render, SSO protection disabled on Vercel) since the
automated deploy couldn't complete the browser-only GitHub App
authorization each platform's dashboard integration expects.
</commit_message>
<xml_diff>
--- a/Darukaa_Earth_Hackathon_Submission.docx
+++ b/Darukaa_Earth_Hackathon_Submission.docx
@@ -200,22 +200,10 @@
         <w:rPr>
           <w:b/>
         </w:rPr>
-        <w:t xml:space="preserve">Live demo URL: </w:t>
+        <w:t xml:space="preserve">Live demo URL (frontend): </w:t>
       </w:r>
       <w:r>
-        <w:rPr>
-          <w:i/>
-          <w:color w:val="B05A00"/>
-        </w:rPr>
-        <w:t>[PLACEHOLDER — fill in before sharing]</w:t>
-      </w:r>
-    </w:p>
-    <w:p>
-      <w:r>
-        <w:rPr>
-          <w:i/>
-        </w:rPr>
-        <w:t>The combined public entry point, if applicable — otherwise link the frontend URL below.</w:t>
+        <w:t>https://darukaa-earth-blush.vercel.app</w:t>
       </w:r>
     </w:p>
     <w:p>
@@ -226,11 +214,7 @@
         <w:t xml:space="preserve">Frontend URL (Vercel): </w:t>
       </w:r>
       <w:r>
-        <w:rPr>
-          <w:i/>
-          <w:color w:val="B05A00"/>
-        </w:rPr>
-        <w:t>[PLACEHOLDER — fill in before sharing]</w:t>
+        <w:t>https://darukaa-earth-blush.vercel.app</w:t>
       </w:r>
     </w:p>
     <w:p>
@@ -241,19 +225,7 @@
         <w:t xml:space="preserve">Backend API URL (Render): </w:t>
       </w:r>
       <w:r>
-        <w:rPr>
-          <w:i/>
-          <w:color w:val="B05A00"/>
-        </w:rPr>
-        <w:t>[PLACEHOLDER — fill in before sharing]</w:t>
-      </w:r>
-    </w:p>
-    <w:p>
-      <w:r>
-        <w:rPr>
-          <w:i/>
-        </w:rPr>
-        <w:t>e.g. https://darukaa-backend.onrender.com — Swagger docs available at /docs</w:t>
+        <w:t>https://darukaa-backend-uaqv.onrender.com  —  Swagger docs at /docs</w:t>
       </w:r>
     </w:p>
     <w:p>
@@ -262,7 +234,7 @@
           <w:b w:val="0"/>
           <w:i/>
         </w:rPr>
-        <w:t>The repository, CI pipeline, and local/Docker environment are complete and verified (see sections 8 and 9). The frontend and backend deployment URLs above are pending creation of a Vercel project and a Render service, which require interactive account access this document's author did not have at submission time — see section 10.</w:t>
+        <w:t>The application is fully deployed and live at the URLs above, with the production database migrated and seeded with the same demonstration dataset described in section 3. Login, dashboard, project/site creation with polygon drawing, analytics charts, and Swagger docs were all verified working against the live deployment before this document was finalized.</w:t>
       </w:r>
     </w:p>
     <w:p>
@@ -347,7 +319,7 @@
           <w:b w:val="0"/>
           <w:i/>
         </w:rPr>
-        <w:t>This account only exists once the seed script (python -m scripts.seed) has been run against the target database — see the repository README, section 11.</w:t>
+        <w:t>This account is already seeded on the live deployment linked above — no setup is required to log in and explore. For a fresh deployment, this account is created by running the seed script (python -m scripts.seed) against the target database — see the repository README, section 11.</w:t>
       </w:r>
     </w:p>
     <w:p>

</xml_diff>